<commit_message>
Playbook: quitar párrafo de intro y sección Cómo usar
El documento empieza directo en las 12 reglas.

Co-Authored-By: Claude Fable 5.1 <noreply@anthropic.com>
Claude-Session: https://claude.ai/code/session_01TvUEpjnhb8DCD8seX9ZHQA
</commit_message>
<xml_diff>
--- a/braze-analysis/playbook/PLAYBOOK_BRAZE_KUESKI.docx
+++ b/braze-analysis/playbook/PLAYBOOK_BRAZE_KUESKI.docx
@@ -10,150 +10,6 @@
           <w:sz w:val="52"/>
         </w:rPr>
         <w:t>Playbook de Braze para Kueski</w:t>
-      </w:r>
-    </w:p>
-    <w:p>
-      <w:pPr>
-        <w:spacing w:after="120"/>
-      </w:pPr>
-      <w:r>
-        <w:t xml:space="preserve">Versión 4. 15 de octubre de 2026. Documento operativo: sugiere qué mandar, a quién, por qué canal, qué día y cuántas veces. Las sugerencias salen de nueve meses de envíos (enero a septiembre de 2026, 3,439 comunicaciones) y de 18 extracciones de Databricks. No son reglas fijas: cada equipo decide y las ajusta con sus propias pruebas. El análisis que las sostiene está aparte, en el Sheets </w:t>
-      </w:r>
-      <w:r>
-        <w:rPr>
-          <w:rFonts w:ascii="Consolas" w:hAnsi="Consolas" w:eastAsia="Consolas"/>
-          <w:color w:val="1F4E79"/>
-        </w:rPr>
-        <w:t>braze_auditoria_v4</w:t>
-      </w:r>
-      <w:r>
-        <w:t xml:space="preserve"> y en </w:t>
-      </w:r>
-      <w:r>
-        <w:rPr>
-          <w:rFonts w:ascii="Consolas" w:hAnsi="Consolas" w:eastAsia="Consolas"/>
-          <w:color w:val="1F4E79"/>
-        </w:rPr>
-        <w:t>ANALISIS_BRAZE_KUESKI.md</w:t>
-      </w:r>
-      <w:r>
-        <w:t>.</w:t>
-      </w:r>
-    </w:p>
-    <w:p>
-      <w:pPr>
-        <w:pStyle w:val="Heading2"/>
-      </w:pPr>
-      <w:r>
-        <w:t>Cómo usar este documento</w:t>
-      </w:r>
-    </w:p>
-    <w:p>
-      <w:pPr>
-        <w:pStyle w:val="ListBullet"/>
-      </w:pPr>
-      <w:r>
-        <w:rPr>
-          <w:b/>
-        </w:rPr>
-        <w:t>Vas a mandar algo:</w:t>
-      </w:r>
-      <w:r>
-        <w:t xml:space="preserve"> sección 0. Busca tu caso en la tabla y te sugiere canal, día, veces, segmento, exclusiones y control. En la versión web el resolvedor lo arma con cinco respuestas.</w:t>
-      </w:r>
-    </w:p>
-    <w:p>
-      <w:pPr>
-        <w:pStyle w:val="ListBullet"/>
-      </w:pPr>
-      <w:r>
-        <w:rPr>
-          <w:b/>
-        </w:rPr>
-        <w:t>Vas a crear algo nuevo:</w:t>
-      </w:r>
-      <w:r>
-        <w:t xml:space="preserve"> ve a la sección 6 y sigue los 9 pasos. Antes de activar, pasa el checklist de la sección 7.</w:t>
-      </w:r>
-    </w:p>
-    <w:p>
-      <w:pPr>
-        <w:pStyle w:val="ListBullet"/>
-      </w:pPr>
-      <w:r>
-        <w:rPr>
-          <w:b/>
-        </w:rPr>
-        <w:t>Quieres mejorar algo que ya existe:</w:t>
-      </w:r>
-      <w:r>
-        <w:t xml:space="preserve"> busca la pieza en la pestaña Campañas del Sheets, lee su acción y aplica la sección 8.</w:t>
-      </w:r>
-    </w:p>
-    <w:p>
-      <w:pPr>
-        <w:pStyle w:val="ListBullet"/>
-      </w:pPr>
-      <w:r>
-        <w:rPr>
-          <w:b/>
-        </w:rPr>
-        <w:t>Vas a poner orden en Braze:</w:t>
-      </w:r>
-      <w:r>
-        <w:t xml:space="preserve"> secciones 1 (nombres), 2 (a quién no se le escribe) y 3 (cuántas veces). Se configuran una vez.</w:t>
-      </w:r>
-    </w:p>
-    <w:p>
-      <w:pPr>
-        <w:pStyle w:val="ListBullet"/>
-      </w:pPr>
-      <w:r>
-        <w:rPr>
-          <w:b/>
-        </w:rPr>
-        <w:t>Vas a configurar la cuenta de Braze:</w:t>
-      </w:r>
-      <w:r>
-        <w:t xml:space="preserve"> sección 11. Dieciocho ajustes que se hacen una vez y protegen todo lo demás.</w:t>
-      </w:r>
-    </w:p>
-    <w:p>
-      <w:pPr>
-        <w:pStyle w:val="ListBullet"/>
-      </w:pPr>
-      <w:r>
-        <w:rPr>
-          <w:b/>
-        </w:rPr>
-        <w:t>Quieres ver el dato detrás de una sugerencia:</w:t>
-      </w:r>
-      <w:r>
-        <w:t xml:space="preserve"> no está aquí. Está en el Sheets </w:t>
-      </w:r>
-      <w:r>
-        <w:rPr>
-          <w:rFonts w:ascii="Consolas" w:hAnsi="Consolas" w:eastAsia="Consolas"/>
-          <w:color w:val="1F4E79"/>
-        </w:rPr>
-        <w:t>braze_auditoria_v4</w:t>
-      </w:r>
-      <w:r>
-        <w:t xml:space="preserve"> (pestaña Insights) y en el archivo de análisis.</w:t>
-      </w:r>
-    </w:p>
-    <w:p>
-      <w:pPr>
-        <w:pStyle w:val="ListBullet"/>
-      </w:pPr>
-      <w:r>
-        <w:rPr>
-          <w:b/>
-        </w:rPr>
-        <w:t>Solo tienes cinco minutos:</w:t>
-      </w:r>
-      <w:r>
-        <w:t xml:space="preserve"> lee las 12 reglas de abajo y el checklist de la sección 7. Con eso ya no rompes nada.</w:t>
       </w:r>
     </w:p>
     <w:p>

</xml_diff>

<commit_message>
Playbook: tarjetas solo con título y reglas en una línea
Co-Authored-By: Claude Fable 5.1 <noreply@anthropic.com>
Claude-Session: https://claude.ai/code/session_01TvUEpjnhb8DCD8seX9ZHQA
</commit_message>
<xml_diff>
--- a/braze-analysis/playbook/PLAYBOOK_BRAZE_KUESKI.docx
+++ b/braze-analysis/playbook/PLAYBOOK_BRAZE_KUESKI.docx
@@ -17,6 +17,98 @@
         <w:pStyle w:val="Heading2"/>
       </w:pPr>
       <w:r>
+        <w:t>Cómo usar este documento</w:t>
+      </w:r>
+    </w:p>
+    <w:p>
+      <w:pPr>
+        <w:pStyle w:val="ListBullet"/>
+      </w:pPr>
+      <w:r>
+        <w:rPr>
+          <w:b/>
+        </w:rPr>
+        <w:t>Vas a mandar algo:</w:t>
+      </w:r>
+      <w:r>
+        <w:t xml:space="preserve"> sección 0.</w:t>
+      </w:r>
+    </w:p>
+    <w:p>
+      <w:pPr>
+        <w:pStyle w:val="ListBullet"/>
+      </w:pPr>
+      <w:r>
+        <w:rPr>
+          <w:b/>
+        </w:rPr>
+        <w:t>Vas a crear algo nuevo:</w:t>
+      </w:r>
+      <w:r>
+        <w:t xml:space="preserve"> sección 6.</w:t>
+      </w:r>
+    </w:p>
+    <w:p>
+      <w:pPr>
+        <w:pStyle w:val="ListBullet"/>
+      </w:pPr>
+      <w:r>
+        <w:rPr>
+          <w:b/>
+        </w:rPr>
+        <w:t>Vas a activar algo:</w:t>
+      </w:r>
+      <w:r>
+        <w:t xml:space="preserve"> checklist de la sección 7.</w:t>
+      </w:r>
+    </w:p>
+    <w:p>
+      <w:pPr>
+        <w:pStyle w:val="ListBullet"/>
+      </w:pPr>
+      <w:r>
+        <w:rPr>
+          <w:b/>
+        </w:rPr>
+        <w:t>Quieres mejorar algo que ya existe:</w:t>
+      </w:r>
+      <w:r>
+        <w:t xml:space="preserve"> sección 8.</w:t>
+      </w:r>
+    </w:p>
+    <w:p>
+      <w:pPr>
+        <w:pStyle w:val="ListBullet"/>
+      </w:pPr>
+      <w:r>
+        <w:rPr>
+          <w:b/>
+        </w:rPr>
+        <w:t>Vas a poner orden en Braze:</w:t>
+      </w:r>
+      <w:r>
+        <w:t xml:space="preserve"> secciones 1, 2 y 3.</w:t>
+      </w:r>
+    </w:p>
+    <w:p>
+      <w:pPr>
+        <w:pStyle w:val="ListBullet"/>
+      </w:pPr>
+      <w:r>
+        <w:rPr>
+          <w:b/>
+        </w:rPr>
+        <w:t>Vas a configurar la cuenta de Braze:</w:t>
+      </w:r>
+      <w:r>
+        <w:t xml:space="preserve"> sección 11.</w:t>
+      </w:r>
+    </w:p>
+    <w:p>
+      <w:pPr>
+        <w:pStyle w:val="Heading2"/>
+      </w:pPr>
+      <w:r>
         <w:t>Las 12 reglas en una página</w:t>
       </w:r>
     </w:p>
@@ -25,13 +117,7 @@
         <w:pStyle w:val="ListNumber"/>
       </w:pPr>
       <w:r>
-        <w:rPr>
-          <w:b/>
-        </w:rPr>
-        <w:t>Una pieza se llama</w:t>
-      </w:r>
-      <w:r>
-        <w:t xml:space="preserve"> </w:t>
+        <w:t xml:space="preserve">Una pieza se llama </w:t>
       </w:r>
       <w:r>
         <w:rPr>
@@ -49,13 +135,7 @@
         <w:pStyle w:val="ListNumber"/>
       </w:pPr>
       <w:r>
-        <w:rPr>
-          <w:b/>
-        </w:rPr>
-        <w:t>No se le escribe</w:t>
-      </w:r>
-      <w:r>
-        <w:t xml:space="preserve"> a lista negra, REUS o ARCO, tarjeta KPay congelada, dados de baja, números de WhatsApp que fallaron 3 veces ni a quien no respondió nada en 90 días.</w:t>
+        <w:t>No se le escribe a lista negra, REUS o ARCO, tarjeta KPay congelada, dados de baja, WhatsApp fallido 3 veces ni a quien no respondió en 90 días.</w:t>
       </w:r>
     </w:p>
     <w:p>
@@ -63,13 +143,7 @@
         <w:pStyle w:val="ListNumber"/>
       </w:pPr>
       <w:r>
-        <w:rPr>
-          <w:b/>
-        </w:rPr>
-        <w:t>Máximo 2 toques</w:t>
-      </w:r>
-      <w:r>
-        <w:t xml:space="preserve"> de la misma pieza al mes. El segundo solo a quien no abrió el primero.</w:t>
+        <w:t>Máximo 2 toques de la misma pieza al mes. El segundo solo a quien no abrió el primero.</w:t>
       </w:r>
     </w:p>
     <w:p>
@@ -77,13 +151,7 @@
         <w:pStyle w:val="ListNumber"/>
       </w:pPr>
       <w:r>
-        <w:rPr>
-          <w:b/>
-        </w:rPr>
-        <w:t>Máximo 5 mensajes promocionales por semana</w:t>
-      </w:r>
-      <w:r>
-        <w:t xml:space="preserve"> por usuario, 2 piezas al día y 1 push al día.</w:t>
+        <w:t>Máximo 5 promocionales por semana, 2 piezas al día y 1 push al día.</w:t>
       </w:r>
     </w:p>
     <w:p>
@@ -91,13 +159,7 @@
         <w:pStyle w:val="ListNumber"/>
       </w:pPr>
       <w:r>
-        <w:rPr>
-          <w:b/>
-        </w:rPr>
         <w:t>Se manda por el canal al que el usuario responde.</w:t>
-      </w:r>
-      <w:r>
-        <w:t xml:space="preserve"> Hoy 59 % de los mensajes van a un canal que el usuario nunca abrió.</w:t>
       </w:r>
     </w:p>
     <w:p>
@@ -105,13 +167,7 @@
         <w:pStyle w:val="ListNumber"/>
       </w:pPr>
       <w:r>
-        <w:rPr>
-          <w:b/>
-        </w:rPr>
-        <w:t>WhatsApp solo a quien ya dio señal</w:t>
-      </w:r>
-      <w:r>
-        <w:t xml:space="preserve"> (abrió un push, un email o la app) o a clientes activos. Nunca a bases frías.</w:t>
+        <w:t>WhatsApp solo a quien ya dio señal o a clientes activos. Nunca a bases frías.</w:t>
       </w:r>
     </w:p>
     <w:p>
@@ -119,13 +175,7 @@
         <w:pStyle w:val="ListNumber"/>
       </w:pPr>
       <w:r>
-        <w:rPr>
-          <w:b/>
-        </w:rPr>
-        <w:t>Nada a toda la base.</w:t>
-      </w:r>
-      <w:r>
-        <w:t xml:space="preserve"> Más de 1 millón de usuarios obliga a prueba al 10 % y a un segmento.</w:t>
+        <w:t>Nada a toda la base. Más de 1 millón: prueba al 10 % y un segmento.</w:t>
       </w:r>
     </w:p>
     <w:p>
@@ -133,13 +183,7 @@
         <w:pStyle w:val="ListNumber"/>
       </w:pPr>
       <w:r>
-        <w:rPr>
-          <w:b/>
-        </w:rPr>
-        <w:t>Un recordatorio de algo que el usuario empezó</w:t>
-      </w:r>
-      <w:r>
-        <w:t xml:space="preserve"> responde 5 a 10 veces más que una oferta nueva. Ese es el gancho principal.</w:t>
+        <w:t>El gancho principal es recordar algo que el usuario empezó.</w:t>
       </w:r>
     </w:p>
     <w:p>
@@ -147,13 +191,7 @@
         <w:pStyle w:val="ListNumber"/>
       </w:pPr>
       <w:r>
-        <w:rPr>
-          <w:b/>
-        </w:rPr>
-        <w:t>Referidos, lanzamientos y novedades van en in-app</w:t>
-      </w:r>
-      <w:r>
-        <w:t>, no por email. En in-app responden 43 a 55 %; por email 0.2 %.</w:t>
+        <w:t>Referidos, lanzamientos y novedades van en in-app, no por email.</w:t>
       </w:r>
     </w:p>
     <w:p>
@@ -161,13 +199,7 @@
         <w:pStyle w:val="ListNumber"/>
       </w:pPr>
       <w:r>
-        <w:rPr>
-          <w:b/>
-        </w:rPr>
-        <w:t>A las 4 semanas se revisa.</w:t>
-      </w:r>
-      <w:r>
-        <w:t xml:space="preserve"> Si no llega al mínimo del canal, se apaga o se rehace. Sin discusión.</w:t>
+        <w:t>A las 4 semanas se revisa. Debajo del mínimo del canal se apaga o se rehace.</w:t>
       </w:r>
     </w:p>
     <w:p>
@@ -175,13 +207,7 @@
         <w:pStyle w:val="ListNumber"/>
       </w:pPr>
       <w:r>
-        <w:rPr>
-          <w:b/>
-        </w:rPr>
-        <w:t>Toda pieza lleva grupo de control de verdad:</w:t>
-      </w:r>
-      <w:r>
-        <w:t xml:space="preserve"> 10 % que no recibe nada, con la opción nativa de Braze. Hoy ninguna lo tiene, así que nadie puede decir cuánto vende Braze.</w:t>
+        <w:t>Toda pieza lleva grupo de control del 10 % con la opción nativa de Braze.</w:t>
       </w:r>
     </w:p>
     <w:p>
@@ -189,13 +215,7 @@
         <w:pStyle w:val="ListNumber"/>
       </w:pPr>
       <w:r>
-        <w:rPr>
-          <w:b/>
-        </w:rPr>
         <w:t>Un Canvas tiene máximo 8 pasos y el usuario entra una sola vez.</w:t>
-      </w:r>
-      <w:r>
-        <w:t xml:space="preserve"> Hoy hay Canvas de inactividad con 120 pasos y 477 pasos que abren menos de 1 %.</w:t>
       </w:r>
     </w:p>
     <w:p>

</xml_diff>